<commit_message>
Add section 3.6.5 discriminant validity (AVE√ method) to pre-survey analysis
Agent-Logs-Url: https://github.com/via-zy/SEM-fsQCA/sessions/8198b740-2730-48e2-8269-21c49a00ff05

Co-authored-by: via-zy <216556376+via-zy@users.noreply.github.com>
</commit_message>
<xml_diff>
--- a/电商223_张纵宇_毕业论文 _4.23初稿.docx
+++ b/电商223_张纵宇_毕业论文 _4.23初稿.docx
@@ -16656,7 +16656,928 @@
     </w:tbl>
     <w:p>
       <w:r>
-        <w:t>由表3-4可知，各题项与其理论维度的关联性良好，量表结构效度通过检验。综合信度与效度检验结果，本问卷满足正式调研要求，可据此开展正式大规模问卷调研。</w:t>
+        <w:t>由表3-4可知，各题项与其理论维度的关联性良好，量表结构效度通过检验。</w:t>
+      </w:r>
+    </w:p>
+    <w:p>
+      <w:pPr>
+        <w:pStyle w:val="4"/>
+      </w:pPr>
+      <w:r>
+        <w:t>3.6.5 判别效度检验（AVE平方根法）</w:t>
+      </w:r>
+    </w:p>
+    <w:p>
+      <w:pPr/>
+      <w:r>
+        <w:t>在完成收敛效度（主成分分析）检验基础上，本文进一步采用Fornell-Larcker准则（Fornell &amp; Larcker，1981）对量表判别效度进行检验。判别效度检验要求：各潜变量AVE的平方根（√AVE）应大于其与其他所有潜变量的相关系数，以确认各构念在测量层面能够有效区分。各构念的AVE值依据主成分分析所得标准化因子载荷计算（AVE = Σλ²/n）。判别效度检验结果如表3-5所示。</w:t>
+      </w:r>
+    </w:p>
+    <w:p>
+      <w:pPr>
+        <w:pStyle w:val="12"/>
+      </w:pPr>
+      <w:r>
+        <w:t>表3-5 判别效度检验：相关矩阵与√AVE（对角线）（预调研，N=157）</w:t>
+      </w:r>
+    </w:p>
+    <w:tbl>
+      <w:tblPr>
+        <w:tblW w:type="auto" w:w="0"/>
+        <w:tblLook w:firstColumn="1" w:firstRow="1" w:lastColumn="0" w:lastRow="0" w:noHBand="0" w:noVBand="1" w:val="04A0"/>
+        <w:tblBorders>
+          <w:top w:val="none"/>
+          <w:left w:val="none"/>
+          <w:bottom w:val="none"/>
+          <w:right w:val="none"/>
+          <w:insideH w:val="none"/>
+          <w:insideV w:val="none"/>
+        </w:tblBorders>
+      </w:tblPr>
+      <w:tblGrid>
+        <w:gridCol w:w="1255"/>
+        <w:gridCol w:w="1255"/>
+        <w:gridCol w:w="1255"/>
+        <w:gridCol w:w="1255"/>
+        <w:gridCol w:w="1255"/>
+        <w:gridCol w:w="1255"/>
+        <w:gridCol w:w="1255"/>
+      </w:tblGrid>
+      <w:tr>
+        <w:tc>
+          <w:tcPr>
+            <w:tcW w:type="dxa" w:w="1255"/>
+            <w:tcBorders>
+              <w:top w:val="single" w:sz="18" w:space="0" w:color="000000"/>
+              <w:bottom w:val="single" w:sz="9" w:space="0" w:color="000000"/>
+              <w:left w:val="none"/>
+              <w:right w:val="none"/>
+              <w:insideH w:val="none"/>
+              <w:insideV w:val="none"/>
+            </w:tcBorders>
+          </w:tcPr>
+          <w:p>
+            <w:r/>
+          </w:p>
+        </w:tc>
+        <w:tc>
+          <w:tcPr>
+            <w:tcW w:type="dxa" w:w="1255"/>
+            <w:tcBorders>
+              <w:top w:val="single" w:sz="18" w:space="0" w:color="000000"/>
+              <w:bottom w:val="single" w:sz="9" w:space="0" w:color="000000"/>
+              <w:left w:val="none"/>
+              <w:right w:val="none"/>
+              <w:insideH w:val="none"/>
+              <w:insideV w:val="none"/>
+            </w:tcBorders>
+          </w:tcPr>
+          <w:p>
+            <w:r>
+              <w:t>GP</w:t>
+            </w:r>
+          </w:p>
+        </w:tc>
+        <w:tc>
+          <w:tcPr>
+            <w:tcW w:type="dxa" w:w="1255"/>
+            <w:tcBorders>
+              <w:top w:val="single" w:sz="18" w:space="0" w:color="000000"/>
+              <w:bottom w:val="single" w:sz="9" w:space="0" w:color="000000"/>
+              <w:left w:val="none"/>
+              <w:right w:val="none"/>
+              <w:insideH w:val="none"/>
+              <w:insideV w:val="none"/>
+            </w:tcBorders>
+          </w:tcPr>
+          <w:p>
+            <w:r>
+              <w:t>TS</w:t>
+            </w:r>
+          </w:p>
+        </w:tc>
+        <w:tc>
+          <w:tcPr>
+            <w:tcW w:type="dxa" w:w="1255"/>
+            <w:tcBorders>
+              <w:top w:val="single" w:sz="18" w:space="0" w:color="000000"/>
+              <w:bottom w:val="single" w:sz="9" w:space="0" w:color="000000"/>
+              <w:left w:val="none"/>
+              <w:right w:val="none"/>
+              <w:insideH w:val="none"/>
+              <w:insideV w:val="none"/>
+            </w:tcBorders>
+          </w:tcPr>
+          <w:p>
+            <w:r>
+              <w:t>IF</w:t>
+            </w:r>
+          </w:p>
+        </w:tc>
+        <w:tc>
+          <w:tcPr>
+            <w:tcW w:type="dxa" w:w="1255"/>
+            <w:tcBorders>
+              <w:top w:val="single" w:sz="18" w:space="0" w:color="000000"/>
+              <w:bottom w:val="single" w:sz="9" w:space="0" w:color="000000"/>
+              <w:left w:val="none"/>
+              <w:right w:val="none"/>
+              <w:insideH w:val="none"/>
+              <w:insideV w:val="none"/>
+            </w:tcBorders>
+          </w:tcPr>
+          <w:p>
+            <w:r>
+              <w:t>TI</w:t>
+            </w:r>
+          </w:p>
+        </w:tc>
+        <w:tc>
+          <w:tcPr>
+            <w:tcW w:type="dxa" w:w="1255"/>
+            <w:tcBorders>
+              <w:top w:val="single" w:sz="18" w:space="0" w:color="000000"/>
+              <w:bottom w:val="single" w:sz="9" w:space="0" w:color="000000"/>
+              <w:left w:val="none"/>
+              <w:right w:val="none"/>
+              <w:insideH w:val="none"/>
+              <w:insideV w:val="none"/>
+            </w:tcBorders>
+          </w:tcPr>
+          <w:p>
+            <w:r>
+              <w:t>DS</w:t>
+            </w:r>
+          </w:p>
+        </w:tc>
+        <w:tc>
+          <w:tcPr>
+            <w:tcW w:type="dxa" w:w="1255"/>
+            <w:tcBorders>
+              <w:top w:val="single" w:sz="18" w:space="0" w:color="000000"/>
+              <w:bottom w:val="single" w:sz="9" w:space="0" w:color="000000"/>
+              <w:left w:val="none"/>
+              <w:right w:val="none"/>
+              <w:insideH w:val="none"/>
+              <w:insideV w:val="none"/>
+            </w:tcBorders>
+          </w:tcPr>
+          <w:p>
+            <w:r>
+              <w:t>EN</w:t>
+            </w:r>
+          </w:p>
+        </w:tc>
+      </w:tr>
+      <w:tr>
+        <w:tc>
+          <w:tcPr>
+            <w:tcW w:type="dxa" w:w="1255"/>
+            <w:tcBorders>
+              <w:top w:val="none"/>
+              <w:left w:val="none"/>
+              <w:bottom w:val="none"/>
+              <w:right w:val="none"/>
+              <w:insideH w:val="none"/>
+              <w:insideV w:val="none"/>
+            </w:tcBorders>
+          </w:tcPr>
+          <w:p>
+            <w:r>
+              <w:t>GP</w:t>
+            </w:r>
+          </w:p>
+        </w:tc>
+        <w:tc>
+          <w:tcPr>
+            <w:tcW w:type="dxa" w:w="1255"/>
+            <w:tcBorders>
+              <w:top w:val="none"/>
+              <w:left w:val="none"/>
+              <w:bottom w:val="none"/>
+              <w:right w:val="none"/>
+              <w:insideH w:val="none"/>
+              <w:insideV w:val="none"/>
+            </w:tcBorders>
+          </w:tcPr>
+          <w:p>
+            <w:r>
+              <w:t>0.870</w:t>
+            </w:r>
+          </w:p>
+        </w:tc>
+        <w:tc>
+          <w:tcPr>
+            <w:tcW w:type="dxa" w:w="1255"/>
+            <w:tcBorders>
+              <w:top w:val="none"/>
+              <w:left w:val="none"/>
+              <w:bottom w:val="none"/>
+              <w:right w:val="none"/>
+              <w:insideH w:val="none"/>
+              <w:insideV w:val="none"/>
+            </w:tcBorders>
+          </w:tcPr>
+          <w:p>
+            <w:r/>
+          </w:p>
+        </w:tc>
+        <w:tc>
+          <w:tcPr>
+            <w:tcW w:type="dxa" w:w="1255"/>
+            <w:tcBorders>
+              <w:top w:val="none"/>
+              <w:left w:val="none"/>
+              <w:bottom w:val="none"/>
+              <w:right w:val="none"/>
+              <w:insideH w:val="none"/>
+              <w:insideV w:val="none"/>
+            </w:tcBorders>
+          </w:tcPr>
+          <w:p>
+            <w:r/>
+          </w:p>
+        </w:tc>
+        <w:tc>
+          <w:tcPr>
+            <w:tcW w:type="dxa" w:w="1255"/>
+            <w:tcBorders>
+              <w:top w:val="none"/>
+              <w:left w:val="none"/>
+              <w:bottom w:val="none"/>
+              <w:right w:val="none"/>
+              <w:insideH w:val="none"/>
+              <w:insideV w:val="none"/>
+            </w:tcBorders>
+          </w:tcPr>
+          <w:p>
+            <w:r/>
+          </w:p>
+        </w:tc>
+        <w:tc>
+          <w:tcPr>
+            <w:tcW w:type="dxa" w:w="1255"/>
+            <w:tcBorders>
+              <w:top w:val="none"/>
+              <w:left w:val="none"/>
+              <w:bottom w:val="none"/>
+              <w:right w:val="none"/>
+              <w:insideH w:val="none"/>
+              <w:insideV w:val="none"/>
+            </w:tcBorders>
+          </w:tcPr>
+          <w:p>
+            <w:r/>
+          </w:p>
+        </w:tc>
+        <w:tc>
+          <w:tcPr>
+            <w:tcW w:type="dxa" w:w="1255"/>
+            <w:tcBorders>
+              <w:top w:val="none"/>
+              <w:left w:val="none"/>
+              <w:bottom w:val="none"/>
+              <w:right w:val="none"/>
+              <w:insideH w:val="none"/>
+              <w:insideV w:val="none"/>
+            </w:tcBorders>
+          </w:tcPr>
+          <w:p>
+            <w:r/>
+          </w:p>
+        </w:tc>
+      </w:tr>
+      <w:tr>
+        <w:tc>
+          <w:tcPr>
+            <w:tcW w:type="dxa" w:w="1255"/>
+            <w:tcBorders>
+              <w:top w:val="none"/>
+              <w:left w:val="none"/>
+              <w:bottom w:val="none"/>
+              <w:right w:val="none"/>
+              <w:insideH w:val="none"/>
+              <w:insideV w:val="none"/>
+            </w:tcBorders>
+          </w:tcPr>
+          <w:p>
+            <w:r>
+              <w:t>TS</w:t>
+            </w:r>
+          </w:p>
+        </w:tc>
+        <w:tc>
+          <w:tcPr>
+            <w:tcW w:type="dxa" w:w="1255"/>
+            <w:tcBorders>
+              <w:top w:val="none"/>
+              <w:left w:val="none"/>
+              <w:bottom w:val="none"/>
+              <w:right w:val="none"/>
+              <w:insideH w:val="none"/>
+              <w:insideV w:val="none"/>
+            </w:tcBorders>
+          </w:tcPr>
+          <w:p>
+            <w:r>
+              <w:t>0.363</w:t>
+            </w:r>
+          </w:p>
+        </w:tc>
+        <w:tc>
+          <w:tcPr>
+            <w:tcW w:type="dxa" w:w="1255"/>
+            <w:tcBorders>
+              <w:top w:val="none"/>
+              <w:left w:val="none"/>
+              <w:bottom w:val="none"/>
+              <w:right w:val="none"/>
+              <w:insideH w:val="none"/>
+              <w:insideV w:val="none"/>
+            </w:tcBorders>
+          </w:tcPr>
+          <w:p>
+            <w:r>
+              <w:t>0.846</w:t>
+            </w:r>
+          </w:p>
+        </w:tc>
+        <w:tc>
+          <w:tcPr>
+            <w:tcW w:type="dxa" w:w="1255"/>
+            <w:tcBorders>
+              <w:top w:val="none"/>
+              <w:left w:val="none"/>
+              <w:bottom w:val="none"/>
+              <w:right w:val="none"/>
+              <w:insideH w:val="none"/>
+              <w:insideV w:val="none"/>
+            </w:tcBorders>
+          </w:tcPr>
+          <w:p>
+            <w:r/>
+          </w:p>
+        </w:tc>
+        <w:tc>
+          <w:tcPr>
+            <w:tcW w:type="dxa" w:w="1255"/>
+            <w:tcBorders>
+              <w:top w:val="none"/>
+              <w:left w:val="none"/>
+              <w:bottom w:val="none"/>
+              <w:right w:val="none"/>
+              <w:insideH w:val="none"/>
+              <w:insideV w:val="none"/>
+            </w:tcBorders>
+          </w:tcPr>
+          <w:p>
+            <w:r/>
+          </w:p>
+        </w:tc>
+        <w:tc>
+          <w:tcPr>
+            <w:tcW w:type="dxa" w:w="1255"/>
+            <w:tcBorders>
+              <w:top w:val="none"/>
+              <w:left w:val="none"/>
+              <w:bottom w:val="none"/>
+              <w:right w:val="none"/>
+              <w:insideH w:val="none"/>
+              <w:insideV w:val="none"/>
+            </w:tcBorders>
+          </w:tcPr>
+          <w:p>
+            <w:r/>
+          </w:p>
+        </w:tc>
+        <w:tc>
+          <w:tcPr>
+            <w:tcW w:type="dxa" w:w="1255"/>
+            <w:tcBorders>
+              <w:top w:val="none"/>
+              <w:left w:val="none"/>
+              <w:bottom w:val="none"/>
+              <w:right w:val="none"/>
+              <w:insideH w:val="none"/>
+              <w:insideV w:val="none"/>
+            </w:tcBorders>
+          </w:tcPr>
+          <w:p>
+            <w:r/>
+          </w:p>
+        </w:tc>
+      </w:tr>
+      <w:tr>
+        <w:tc>
+          <w:tcPr>
+            <w:tcW w:type="dxa" w:w="1255"/>
+            <w:tcBorders>
+              <w:top w:val="none"/>
+              <w:left w:val="none"/>
+              <w:bottom w:val="none"/>
+              <w:right w:val="none"/>
+              <w:insideH w:val="none"/>
+              <w:insideV w:val="none"/>
+            </w:tcBorders>
+          </w:tcPr>
+          <w:p>
+            <w:r>
+              <w:t>IF</w:t>
+            </w:r>
+          </w:p>
+        </w:tc>
+        <w:tc>
+          <w:tcPr>
+            <w:tcW w:type="dxa" w:w="1255"/>
+            <w:tcBorders>
+              <w:top w:val="none"/>
+              <w:left w:val="none"/>
+              <w:bottom w:val="none"/>
+              <w:right w:val="none"/>
+              <w:insideH w:val="none"/>
+              <w:insideV w:val="none"/>
+            </w:tcBorders>
+          </w:tcPr>
+          <w:p>
+            <w:r>
+              <w:t>0.378</w:t>
+            </w:r>
+          </w:p>
+        </w:tc>
+        <w:tc>
+          <w:tcPr>
+            <w:tcW w:type="dxa" w:w="1255"/>
+            <w:tcBorders>
+              <w:top w:val="none"/>
+              <w:left w:val="none"/>
+              <w:bottom w:val="none"/>
+              <w:right w:val="none"/>
+              <w:insideH w:val="none"/>
+              <w:insideV w:val="none"/>
+            </w:tcBorders>
+          </w:tcPr>
+          <w:p>
+            <w:r>
+              <w:t>0.391</w:t>
+            </w:r>
+          </w:p>
+        </w:tc>
+        <w:tc>
+          <w:tcPr>
+            <w:tcW w:type="dxa" w:w="1255"/>
+            <w:tcBorders>
+              <w:top w:val="none"/>
+              <w:left w:val="none"/>
+              <w:bottom w:val="none"/>
+              <w:right w:val="none"/>
+              <w:insideH w:val="none"/>
+              <w:insideV w:val="none"/>
+            </w:tcBorders>
+          </w:tcPr>
+          <w:p>
+            <w:r>
+              <w:t>0.892</w:t>
+            </w:r>
+          </w:p>
+        </w:tc>
+        <w:tc>
+          <w:tcPr>
+            <w:tcW w:type="dxa" w:w="1255"/>
+            <w:tcBorders>
+              <w:top w:val="none"/>
+              <w:left w:val="none"/>
+              <w:bottom w:val="none"/>
+              <w:right w:val="none"/>
+              <w:insideH w:val="none"/>
+              <w:insideV w:val="none"/>
+            </w:tcBorders>
+          </w:tcPr>
+          <w:p>
+            <w:r/>
+          </w:p>
+        </w:tc>
+        <w:tc>
+          <w:tcPr>
+            <w:tcW w:type="dxa" w:w="1255"/>
+            <w:tcBorders>
+              <w:top w:val="none"/>
+              <w:left w:val="none"/>
+              <w:bottom w:val="none"/>
+              <w:right w:val="none"/>
+              <w:insideH w:val="none"/>
+              <w:insideV w:val="none"/>
+            </w:tcBorders>
+          </w:tcPr>
+          <w:p>
+            <w:r/>
+          </w:p>
+        </w:tc>
+        <w:tc>
+          <w:tcPr>
+            <w:tcW w:type="dxa" w:w="1255"/>
+            <w:tcBorders>
+              <w:top w:val="none"/>
+              <w:left w:val="none"/>
+              <w:bottom w:val="none"/>
+              <w:right w:val="none"/>
+              <w:insideH w:val="none"/>
+              <w:insideV w:val="none"/>
+            </w:tcBorders>
+          </w:tcPr>
+          <w:p>
+            <w:r/>
+          </w:p>
+        </w:tc>
+      </w:tr>
+      <w:tr>
+        <w:tc>
+          <w:tcPr>
+            <w:tcW w:type="dxa" w:w="1255"/>
+            <w:tcBorders>
+              <w:top w:val="none"/>
+              <w:left w:val="none"/>
+              <w:bottom w:val="none"/>
+              <w:right w:val="none"/>
+              <w:insideH w:val="none"/>
+              <w:insideV w:val="none"/>
+            </w:tcBorders>
+          </w:tcPr>
+          <w:p>
+            <w:r>
+              <w:t>TI</w:t>
+            </w:r>
+          </w:p>
+        </w:tc>
+        <w:tc>
+          <w:tcPr>
+            <w:tcW w:type="dxa" w:w="1255"/>
+            <w:tcBorders>
+              <w:top w:val="none"/>
+              <w:left w:val="none"/>
+              <w:bottom w:val="none"/>
+              <w:right w:val="none"/>
+              <w:insideH w:val="none"/>
+              <w:insideV w:val="none"/>
+            </w:tcBorders>
+          </w:tcPr>
+          <w:p>
+            <w:r>
+              <w:t>0.194</w:t>
+            </w:r>
+          </w:p>
+        </w:tc>
+        <w:tc>
+          <w:tcPr>
+            <w:tcW w:type="dxa" w:w="1255"/>
+            <w:tcBorders>
+              <w:top w:val="none"/>
+              <w:left w:val="none"/>
+              <w:bottom w:val="none"/>
+              <w:right w:val="none"/>
+              <w:insideH w:val="none"/>
+              <w:insideV w:val="none"/>
+            </w:tcBorders>
+          </w:tcPr>
+          <w:p>
+            <w:r>
+              <w:t>0.147</w:t>
+            </w:r>
+          </w:p>
+        </w:tc>
+        <w:tc>
+          <w:tcPr>
+            <w:tcW w:type="dxa" w:w="1255"/>
+            <w:tcBorders>
+              <w:top w:val="none"/>
+              <w:left w:val="none"/>
+              <w:bottom w:val="none"/>
+              <w:right w:val="none"/>
+              <w:insideH w:val="none"/>
+              <w:insideV w:val="none"/>
+            </w:tcBorders>
+          </w:tcPr>
+          <w:p>
+            <w:r>
+              <w:t>0.144</w:t>
+            </w:r>
+          </w:p>
+        </w:tc>
+        <w:tc>
+          <w:tcPr>
+            <w:tcW w:type="dxa" w:w="1255"/>
+            <w:tcBorders>
+              <w:top w:val="none"/>
+              <w:left w:val="none"/>
+              <w:bottom w:val="none"/>
+              <w:right w:val="none"/>
+              <w:insideH w:val="none"/>
+              <w:insideV w:val="none"/>
+            </w:tcBorders>
+          </w:tcPr>
+          <w:p>
+            <w:r>
+              <w:t>0.854</w:t>
+            </w:r>
+          </w:p>
+        </w:tc>
+        <w:tc>
+          <w:tcPr>
+            <w:tcW w:type="dxa" w:w="1255"/>
+            <w:tcBorders>
+              <w:top w:val="none"/>
+              <w:left w:val="none"/>
+              <w:bottom w:val="none"/>
+              <w:right w:val="none"/>
+              <w:insideH w:val="none"/>
+              <w:insideV w:val="none"/>
+            </w:tcBorders>
+          </w:tcPr>
+          <w:p>
+            <w:r/>
+          </w:p>
+        </w:tc>
+        <w:tc>
+          <w:tcPr>
+            <w:tcW w:type="dxa" w:w="1255"/>
+            <w:tcBorders>
+              <w:top w:val="none"/>
+              <w:left w:val="none"/>
+              <w:bottom w:val="none"/>
+              <w:right w:val="none"/>
+              <w:insideH w:val="none"/>
+              <w:insideV w:val="none"/>
+            </w:tcBorders>
+          </w:tcPr>
+          <w:p>
+            <w:r/>
+          </w:p>
+        </w:tc>
+      </w:tr>
+      <w:tr>
+        <w:tc>
+          <w:tcPr>
+            <w:tcW w:type="dxa" w:w="1255"/>
+            <w:tcBorders>
+              <w:top w:val="none"/>
+              <w:left w:val="none"/>
+              <w:bottom w:val="none"/>
+              <w:right w:val="none"/>
+              <w:insideH w:val="none"/>
+              <w:insideV w:val="none"/>
+            </w:tcBorders>
+          </w:tcPr>
+          <w:p>
+            <w:r>
+              <w:t>DS</w:t>
+            </w:r>
+          </w:p>
+        </w:tc>
+        <w:tc>
+          <w:tcPr>
+            <w:tcW w:type="dxa" w:w="1255"/>
+            <w:tcBorders>
+              <w:top w:val="none"/>
+              <w:left w:val="none"/>
+              <w:bottom w:val="none"/>
+              <w:right w:val="none"/>
+              <w:insideH w:val="none"/>
+              <w:insideV w:val="none"/>
+            </w:tcBorders>
+          </w:tcPr>
+          <w:p>
+            <w:r>
+              <w:t>0.208</w:t>
+            </w:r>
+          </w:p>
+        </w:tc>
+        <w:tc>
+          <w:tcPr>
+            <w:tcW w:type="dxa" w:w="1255"/>
+            <w:tcBorders>
+              <w:top w:val="none"/>
+              <w:left w:val="none"/>
+              <w:bottom w:val="none"/>
+              <w:right w:val="none"/>
+              <w:insideH w:val="none"/>
+              <w:insideV w:val="none"/>
+            </w:tcBorders>
+          </w:tcPr>
+          <w:p>
+            <w:r>
+              <w:t>0.175</w:t>
+            </w:r>
+          </w:p>
+        </w:tc>
+        <w:tc>
+          <w:tcPr>
+            <w:tcW w:type="dxa" w:w="1255"/>
+            <w:tcBorders>
+              <w:top w:val="none"/>
+              <w:left w:val="none"/>
+              <w:bottom w:val="none"/>
+              <w:right w:val="none"/>
+              <w:insideH w:val="none"/>
+              <w:insideV w:val="none"/>
+            </w:tcBorders>
+          </w:tcPr>
+          <w:p>
+            <w:r>
+              <w:t>0.233</w:t>
+            </w:r>
+          </w:p>
+        </w:tc>
+        <w:tc>
+          <w:tcPr>
+            <w:tcW w:type="dxa" w:w="1255"/>
+            <w:tcBorders>
+              <w:top w:val="none"/>
+              <w:left w:val="none"/>
+              <w:bottom w:val="none"/>
+              <w:right w:val="none"/>
+              <w:insideH w:val="none"/>
+              <w:insideV w:val="none"/>
+            </w:tcBorders>
+          </w:tcPr>
+          <w:p>
+            <w:r>
+              <w:t>0.305</w:t>
+            </w:r>
+          </w:p>
+        </w:tc>
+        <w:tc>
+          <w:tcPr>
+            <w:tcW w:type="dxa" w:w="1255"/>
+            <w:tcBorders>
+              <w:top w:val="none"/>
+              <w:left w:val="none"/>
+              <w:bottom w:val="none"/>
+              <w:right w:val="none"/>
+              <w:insideH w:val="none"/>
+              <w:insideV w:val="none"/>
+            </w:tcBorders>
+          </w:tcPr>
+          <w:p>
+            <w:r>
+              <w:t>0.894</w:t>
+            </w:r>
+          </w:p>
+        </w:tc>
+        <w:tc>
+          <w:tcPr>
+            <w:tcW w:type="dxa" w:w="1255"/>
+            <w:tcBorders>
+              <w:top w:val="none"/>
+              <w:left w:val="none"/>
+              <w:bottom w:val="none"/>
+              <w:right w:val="none"/>
+              <w:insideH w:val="none"/>
+              <w:insideV w:val="none"/>
+            </w:tcBorders>
+          </w:tcPr>
+          <w:p>
+            <w:r/>
+          </w:p>
+        </w:tc>
+      </w:tr>
+      <w:tr>
+        <w:tc>
+          <w:tcPr>
+            <w:tcW w:type="dxa" w:w="1255"/>
+            <w:tcBorders>
+              <w:bottom w:val="single" w:sz="18" w:space="0" w:color="000000"/>
+              <w:top w:val="none"/>
+              <w:left w:val="none"/>
+              <w:right w:val="none"/>
+              <w:insideH w:val="none"/>
+              <w:insideV w:val="none"/>
+            </w:tcBorders>
+          </w:tcPr>
+          <w:p>
+            <w:r>
+              <w:t>EN</w:t>
+            </w:r>
+          </w:p>
+        </w:tc>
+        <w:tc>
+          <w:tcPr>
+            <w:tcW w:type="dxa" w:w="1255"/>
+            <w:tcBorders>
+              <w:bottom w:val="single" w:sz="18" w:space="0" w:color="000000"/>
+              <w:top w:val="none"/>
+              <w:left w:val="none"/>
+              <w:right w:val="none"/>
+              <w:insideH w:val="none"/>
+              <w:insideV w:val="none"/>
+            </w:tcBorders>
+          </w:tcPr>
+          <w:p>
+            <w:r>
+              <w:t>0.042</w:t>
+            </w:r>
+          </w:p>
+        </w:tc>
+        <w:tc>
+          <w:tcPr>
+            <w:tcW w:type="dxa" w:w="1255"/>
+            <w:tcBorders>
+              <w:bottom w:val="single" w:sz="18" w:space="0" w:color="000000"/>
+              <w:top w:val="none"/>
+              <w:left w:val="none"/>
+              <w:right w:val="none"/>
+              <w:insideH w:val="none"/>
+              <w:insideV w:val="none"/>
+            </w:tcBorders>
+          </w:tcPr>
+          <w:p>
+            <w:r>
+              <w:t>0.140</w:t>
+            </w:r>
+          </w:p>
+        </w:tc>
+        <w:tc>
+          <w:tcPr>
+            <w:tcW w:type="dxa" w:w="1255"/>
+            <w:tcBorders>
+              <w:bottom w:val="single" w:sz="18" w:space="0" w:color="000000"/>
+              <w:top w:val="none"/>
+              <w:left w:val="none"/>
+              <w:right w:val="none"/>
+              <w:insideH w:val="none"/>
+              <w:insideV w:val="none"/>
+            </w:tcBorders>
+          </w:tcPr>
+          <w:p>
+            <w:r>
+              <w:t>0.092</w:t>
+            </w:r>
+          </w:p>
+        </w:tc>
+        <w:tc>
+          <w:tcPr>
+            <w:tcW w:type="dxa" w:w="1255"/>
+            <w:tcBorders>
+              <w:bottom w:val="single" w:sz="18" w:space="0" w:color="000000"/>
+              <w:top w:val="none"/>
+              <w:left w:val="none"/>
+              <w:right w:val="none"/>
+              <w:insideH w:val="none"/>
+              <w:insideV w:val="none"/>
+            </w:tcBorders>
+          </w:tcPr>
+          <w:p>
+            <w:r>
+              <w:t>0.276</w:t>
+            </w:r>
+          </w:p>
+        </w:tc>
+        <w:tc>
+          <w:tcPr>
+            <w:tcW w:type="dxa" w:w="1255"/>
+            <w:tcBorders>
+              <w:bottom w:val="single" w:sz="18" w:space="0" w:color="000000"/>
+              <w:top w:val="none"/>
+              <w:left w:val="none"/>
+              <w:right w:val="none"/>
+              <w:insideH w:val="none"/>
+              <w:insideV w:val="none"/>
+            </w:tcBorders>
+          </w:tcPr>
+          <w:p>
+            <w:r>
+              <w:t>0.307</w:t>
+            </w:r>
+          </w:p>
+        </w:tc>
+        <w:tc>
+          <w:tcPr>
+            <w:tcW w:type="dxa" w:w="1255"/>
+            <w:tcBorders>
+              <w:bottom w:val="single" w:sz="18" w:space="0" w:color="000000"/>
+              <w:top w:val="none"/>
+              <w:left w:val="none"/>
+              <w:right w:val="none"/>
+              <w:insideH w:val="none"/>
+              <w:insideV w:val="none"/>
+            </w:tcBorders>
+          </w:tcPr>
+          <w:p>
+            <w:r>
+              <w:t>0.871</w:t>
+            </w:r>
+          </w:p>
+        </w:tc>
+      </w:tr>
+    </w:tbl>
+    <w:p>
+      <w:pPr/>
+      <w:r>
+        <w:t>注：对角线为各潜变量AVE平方根（√AVE），下三角为构念间Pearson相关系数。</w:t>
+      </w:r>
+    </w:p>
+    <w:p>
+      <w:pPr/>
+      <w:r>
+        <w:t>由表3-5可知，六个潜变量的√AVE值介于0.846至0.894之间，均显著高于各构念与其他构念间的Pearson相关系数（最大相关系数为0.391，位于GP-IF之间）。各构念√AVE均大于其所涉及的所有相关系数，符合Fornell-Larcker判别效度标准，表明六个潜变量在测量层面具有良好的区分效度，各构念间不存在显著的冗余性。综合信度检验、收敛效度检验与判别效度检验结果，本问卷量表质量良好，满足正式调研要求，可据此开展正式大规模问卷调研。</w:t>
       </w:r>
     </w:p>
     <w:p>

</xml_diff>